<commit_message>
Patch Next.js to 14.2.35 — clears the CVEs blocking the Railway deploy
Railway's deployment scanner refused the build on next@14.2.15:
  CVE-2025-55184 (HIGH)  GHSA-mwv6-3258-q52c
  CVE-2025-67779 (HIGH)  GHSA-5j59-xgg2-r9c4

Upgraded to ^14.2.35 as the scanner directed — a patch within the same minor
line, so no API changes. Verified: production build compiles, image runs
next 14.2.35, and every route plus the proxied session still answers 200.

A wider npm audit still flags the 14.x line, with Next 16 (React 19) as the only
offered remedy. That is a major upgrade and not something to attempt between now
and the assessed demo, so it is recorded as TD-18 with the reachability analysis:
the residual advisories target next/image, Server Actions, middleware, i18n
routing and Route Handlers, none of which this application uses, and the nested
postcss 8.4.31 runs at build time over first-party CSS only.
</commit_message>
<xml_diff>
--- a/docs/MediCore_HMS_Technical_Debt_Ledger_v1.4.docx
+++ b/docs/MediCore_HMS_Technical_Debt_Ledger_v1.4.docx
@@ -2067,6 +2067,138 @@
                 <w:szCs w:val="20"/>
               </w:rPr>
               <w:t>Low · open</w:t>
+            </w:r>
+          </w:p>
+        </w:tc>
+      </w:tr>
+      <w:tr>
+        <w:tc>
+          <w:tcPr>
+            <w:tcW w:type="dxa" w:w="700"/>
+            <w:tcMar>
+              <w:top w:type="dxa" w:w="60"/>
+              <w:left w:type="dxa" w:w="100"/>
+              <w:bottom w:type="dxa" w:w="60"/>
+              <w:right w:type="dxa" w:w="100"/>
+            </w:tcMar>
+          </w:tcPr>
+          <w:p>
+            <w:pPr>
+              <w:spacing w:after="0" w:line="240"/>
+            </w:pPr>
+            <w:r>
+              <w:rPr>
+                <w:rFonts w:ascii="Calibri" w:cs="Calibri" w:eastAsia="Calibri" w:hAnsi="Calibri"/>
+                <w:b w:val="false"/>
+                <w:bCs w:val="false"/>
+                <w:sz w:val="20"/>
+                <w:szCs w:val="20"/>
+              </w:rPr>
+              <w:t>TD-18</w:t>
+            </w:r>
+          </w:p>
+        </w:tc>
+        <w:tc>
+          <w:tcPr>
+            <w:tcW w:type="dxa" w:w="2300"/>
+            <w:tcMar>
+              <w:top w:type="dxa" w:w="60"/>
+              <w:left w:type="dxa" w:w="100"/>
+              <w:bottom w:type="dxa" w:w="60"/>
+              <w:right w:type="dxa" w:w="100"/>
+            </w:tcMar>
+          </w:tcPr>
+          <w:p>
+            <w:pPr>
+              <w:spacing w:after="0" w:line="240"/>
+            </w:pPr>
+            <w:r>
+              <w:rPr>
+                <w:rFonts w:ascii="Calibri" w:cs="Calibri" w:eastAsia="Calibri" w:hAnsi="Calibri"/>
+                <w:b w:val="false"/>
+                <w:bCs w:val="false"/>
+                <w:sz w:val="20"/>
+                <w:szCs w:val="20"/>
+              </w:rPr>
+              <w:t>The web tier is pinned to the Next.js 14.2 line. Railway's deployment scanner blocked the first deploy on next@14.2.15 (CVE-2025-55184, CVE-2025-67779, both HIGH); the patch to 14.2.35 clears both. A wider npm audit still reports the 14.x line as affected by a long advisory list whose only offered remedy is Next 16 — a major upgrade requiring React 19.</w:t>
+            </w:r>
+          </w:p>
+        </w:tc>
+        <w:tc>
+          <w:tcPr>
+            <w:tcW w:type="dxa" w:w="2300"/>
+            <w:tcMar>
+              <w:top w:type="dxa" w:w="60"/>
+              <w:left w:type="dxa" w:w="100"/>
+              <w:bottom w:type="dxa" w:w="60"/>
+              <w:right w:type="dxa" w:w="100"/>
+            </w:tcMar>
+          </w:tcPr>
+          <w:p>
+            <w:pPr>
+              <w:spacing w:after="0" w:line="240"/>
+            </w:pPr>
+            <w:r>
+              <w:rPr>
+                <w:rFonts w:ascii="Calibri" w:cs="Calibri" w:eastAsia="Calibri" w:hAnsi="Calibri"/>
+                <w:b w:val="false"/>
+                <w:bCs w:val="false"/>
+                <w:sz w:val="20"/>
+                <w:szCs w:val="20"/>
+              </w:rPr>
+              <w:t>Deployment-gating risk is resolved. The residual advisories concern features this application does not use: it has no next/image, no Server Actions, no middleware, no i18n routing and no Route Handlers — 17 client components and a single /api/* rewrite. The nested postcss 8.4.31 flagged inside Next runs at build time over first-party CSS only; no attacker-controlled stylesheet is ever parsed. Top-level postcss is already patched at 8.5.26.</w:t>
+            </w:r>
+          </w:p>
+        </w:tc>
+        <w:tc>
+          <w:tcPr>
+            <w:tcW w:type="dxa" w:w="2300"/>
+            <w:tcMar>
+              <w:top w:type="dxa" w:w="60"/>
+              <w:left w:type="dxa" w:w="100"/>
+              <w:bottom w:type="dxa" w:w="60"/>
+              <w:right w:type="dxa" w:w="100"/>
+            </w:tcMar>
+          </w:tcPr>
+          <w:p>
+            <w:pPr>
+              <w:spacing w:after="0" w:line="240"/>
+            </w:pPr>
+            <w:r>
+              <w:rPr>
+                <w:rFonts w:ascii="Calibri" w:cs="Calibri" w:eastAsia="Calibri" w:hAnsi="Calibri"/>
+                <w:b w:val="false"/>
+                <w:bCs w:val="false"/>
+                <w:sz w:val="20"/>
+                <w:szCs w:val="20"/>
+              </w:rPr>
+              <w:t>Upgrade to Next 16 with React 19 after the assessed demo, behind the CI build gate and the browser E2E evidence in docs/evidence. Interim control: the monthly npm audit review already required by the Maintenance Plan §7.</w:t>
+            </w:r>
+          </w:p>
+        </w:tc>
+        <w:tc>
+          <w:tcPr>
+            <w:tcW w:type="dxa" w:w="1500"/>
+            <w:tcMar>
+              <w:top w:type="dxa" w:w="60"/>
+              <w:left w:type="dxa" w:w="100"/>
+              <w:bottom w:type="dxa" w:w="60"/>
+              <w:right w:type="dxa" w:w="100"/>
+            </w:tcMar>
+          </w:tcPr>
+          <w:p>
+            <w:pPr>
+              <w:spacing w:after="0" w:line="240"/>
+            </w:pPr>
+            <w:r>
+              <w:rPr>
+                <w:rFonts w:ascii="Calibri" w:cs="Calibri" w:eastAsia="Calibri" w:hAnsi="Calibri"/>
+                <w:b w:val="false"/>
+                <w:bCs w:val="false"/>
+                <w:sz w:val="20"/>
+                <w:szCs w:val="20"/>
+              </w:rPr>
+              <w:t>Medium · accepted for the demo, upgrade scheduled</w:t>
             </w:r>
           </w:p>
         </w:tc>

</xml_diff>